<commit_message>
add experiment 7 git evidence
</commit_message>
<xml_diff>
--- a/reports/exp7-process-management/23251004-郭逸晨-实验报告7.docx
+++ b/reports/exp7-process-management/23251004-郭逸晨-实验报告7.docx
@@ -4547,171 +4547,116 @@
       </w:r>
     </w:p>
     <w:p>
-      <w:pPr>
-        <w:spacing w:after="80" w:line="276" w:lineRule="auto"/>
-      </w:pPr>
-      <w:r>
-        <w:rPr>
-          <w:rFonts w:ascii="宋体" w:hAnsi="宋体" w:eastAsia="宋体" w:cs="宋体"/>
-          <w:b/>
-          <w:sz w:val="21"/>
-        </w:rPr>
-        <w:t>目的：</w:t>
-      </w:r>
-      <w:r>
-        <w:rPr>
-          <w:rFonts w:ascii="宋体" w:hAnsi="宋体" w:eastAsia="宋体" w:cs="宋体"/>
-          <w:sz w:val="21"/>
-        </w:rPr>
-        <w:t>记录实验7相关代码和报告文件的版本管理结果，为实验过程提供可追溯证据。</w:t>
-      </w:r>
-    </w:p>
-    <w:p>
-      <w:pPr>
-        <w:spacing w:after="80" w:line="276" w:lineRule="auto"/>
-      </w:pPr>
-      <w:r>
-        <w:rPr>
-          <w:rFonts w:ascii="宋体" w:hAnsi="宋体" w:eastAsia="宋体" w:cs="宋体"/>
-          <w:b/>
-          <w:sz w:val="21"/>
-        </w:rPr>
-        <w:t>命令：</w:t>
-      </w:r>
-      <w:r>
-        <w:rPr>
-          <w:rFonts w:ascii="宋体" w:hAnsi="宋体" w:eastAsia="宋体" w:cs="宋体"/>
-          <w:sz w:val="21"/>
-        </w:rPr>
-      </w:r>
-    </w:p>
-    <w:p>
-      <w:pPr>
-        <w:pStyle w:val="Code"/>
-        <w:spacing w:after="20" w:line="240" w:lineRule="auto"/>
-        <w:ind w:left="240"/>
-      </w:pPr>
-      <w:r>
-        <w:rPr>
-          <w:rFonts w:ascii="Consolas" w:hAnsi="Consolas" w:eastAsia="Consolas" w:cs="Consolas"/>
-          <w:b w:val="0"/>
-          <w:sz w:val="18"/>
-        </w:rPr>
+      <w:r>
+        <w:t>目的：记录实验7相关代码、用户程序和报告文件的 Git 提交与远程推送结果。</w:t>
+      </w:r>
+    </w:p>
+    <w:p>
+      <w:r>
+        <w:t>实际执行命令：</w:t>
+      </w:r>
+    </w:p>
+    <w:p>
+      <w:r>
         <w:t>cd /mnt</w:t>
       </w:r>
     </w:p>
     <w:p>
-      <w:pPr>
-        <w:pStyle w:val="Code"/>
-        <w:spacing w:after="20" w:line="240" w:lineRule="auto"/>
-        <w:ind w:left="240"/>
-      </w:pPr>
-      <w:r>
-        <w:rPr>
-          <w:rFonts w:ascii="Consolas" w:hAnsi="Consolas" w:eastAsia="Consolas" w:cs="Consolas"/>
-          <w:b w:val="0"/>
-          <w:sz w:val="18"/>
-        </w:rPr>
+      <w:r>
         <w:t>git status --short</w:t>
       </w:r>
     </w:p>
     <w:p>
-      <w:pPr>
-        <w:pStyle w:val="Code"/>
-        <w:spacing w:after="20" w:line="240" w:lineRule="auto"/>
-        <w:ind w:left="240"/>
-      </w:pPr>
-      <w:r>
-        <w:rPr>
-          <w:rFonts w:ascii="Consolas" w:hAnsi="Consolas" w:eastAsia="Consolas" w:cs="Consolas"/>
-          <w:b w:val="0"/>
-          <w:sz w:val="18"/>
-        </w:rPr>
-        <w:t>git diff --stat</w:t>
-      </w:r>
-    </w:p>
-    <w:p>
-      <w:pPr>
-        <w:pStyle w:val="Code"/>
-        <w:spacing w:after="20" w:line="240" w:lineRule="auto"/>
-        <w:ind w:left="240"/>
-      </w:pPr>
-      <w:r>
-        <w:rPr>
-          <w:rFonts w:ascii="Consolas" w:hAnsi="Consolas" w:eastAsia="Consolas" w:cs="Consolas"/>
-          <w:b w:val="0"/>
-          <w:sz w:val="18"/>
-        </w:rPr>
-        <w:t>git log --oneline -5</w:t>
-      </w:r>
-    </w:p>
-    <w:p>
-      <w:pPr>
-        <w:spacing w:after="80" w:line="276" w:lineRule="auto"/>
-      </w:pPr>
-      <w:r>
-        <w:rPr>
-          <w:rFonts w:ascii="宋体" w:hAnsi="宋体" w:eastAsia="宋体" w:cs="宋体"/>
-          <w:b/>
-          <w:sz w:val="21"/>
-        </w:rPr>
-        <w:t>成功标志：</w:t>
-      </w:r>
-      <w:r>
-        <w:rPr>
-          <w:rFonts w:ascii="宋体" w:hAnsi="宋体" w:eastAsia="宋体" w:cs="宋体"/>
-          <w:sz w:val="21"/>
-        </w:rPr>
-      </w:r>
-    </w:p>
-    <w:p>
-      <w:pPr>
-        <w:pStyle w:val="ListBullet"/>
-        <w:spacing w:after="40" w:line="276" w:lineRule="auto"/>
-      </w:pPr>
-      <w:r>
-        <w:rPr>
-          <w:rFonts w:ascii="宋体" w:hAnsi="宋体" w:eastAsia="宋体" w:cs="宋体"/>
-          <w:sz w:val="21"/>
-        </w:rPr>
-        <w:t>git status 能显示当前工作区状态。</w:t>
-      </w:r>
-    </w:p>
-    <w:p>
-      <w:pPr>
-        <w:pStyle w:val="ListBullet"/>
-        <w:spacing w:after="40" w:line="276" w:lineRule="auto"/>
-      </w:pPr>
-      <w:r>
-        <w:rPr>
-          <w:rFonts w:ascii="宋体" w:hAnsi="宋体" w:eastAsia="宋体" w:cs="宋体"/>
-          <w:sz w:val="21"/>
-        </w:rPr>
-        <w:t>git diff --stat 能概括实验7相关文件变更范围。</w:t>
-      </w:r>
-    </w:p>
-    <w:p>
-      <w:pPr>
-        <w:pStyle w:val="ListBullet"/>
-        <w:spacing w:after="40" w:line="276" w:lineRule="auto"/>
-      </w:pPr>
-      <w:r>
-        <w:rPr>
-          <w:rFonts w:ascii="宋体" w:hAnsi="宋体" w:eastAsia="宋体" w:cs="宋体"/>
-          <w:sz w:val="21"/>
-        </w:rPr>
-        <w:t>git log --oneline -5 能显示最近提交记录。</w:t>
-      </w:r>
-    </w:p>
-    <w:p>
-      <w:pPr>
-        <w:spacing w:after="80" w:line="276" w:lineRule="auto"/>
-      </w:pPr>
-      <w:r>
-        <w:rPr>
-          <w:rFonts w:ascii="宋体" w:hAnsi="宋体" w:eastAsia="宋体" w:cs="宋体"/>
-          <w:sz w:val="21"/>
-        </w:rPr>
+      <w:r>
+        <w:t>git branch --show-current</w:t>
+      </w:r>
+    </w:p>
+    <w:p>
+      <w:r>
+        <w:t>git remote -v</w:t>
+      </w:r>
+    </w:p>
+    <w:p>
+      <w:r>
+        <w:t>git add os user reports/exp7-process-management</w:t>
+      </w:r>
+    </w:p>
+    <w:p>
+      <w:r>
+        <w:t>git status --short</w:t>
+      </w:r>
+    </w:p>
+    <w:p>
+      <w:r>
+        <w:t>git commit -m "完成实验7"</w:t>
+      </w:r>
+    </w:p>
+    <w:p>
+      <w:r>
+        <w:t>git switch -c exp7-process-management</w:t>
+      </w:r>
+    </w:p>
+    <w:p>
+      <w:r>
+        <w:t>git push -u github exp7-process-management</w:t>
+      </w:r>
+    </w:p>
+    <w:p>
+      <w:r>
+        <w:t>成功标志：提交已生成，并创建 exp7-process-management 分支推送到远程 GitHub 仓库。</w:t>
+      </w:r>
+    </w:p>
+    <w:p>
+      <w:r>
+        <w:t>截图文件：git-redacted.png（由 git.png 脱敏生成，已遮盖密码/令牌输入行）。</w:t>
+      </w:r>
+    </w:p>
+    <w:p>
+      <w:r>
+        <w:t>图：Git 提交与远程推送成功截图（已脱敏）</w:t>
+      </w:r>
+    </w:p>
+    <w:p>
+      <w:pPr>
+        <w:jc w:val="center"/>
+      </w:pPr>
+      <w:r>
+        <w:drawing>
+          <wp:inline xmlns:a="http://schemas.openxmlformats.org/drawingml/2006/main" xmlns:pic="http://schemas.openxmlformats.org/drawingml/2006/picture">
+            <wp:extent cx="5303520" cy="2839401"/>
+            <wp:docPr id="34" name="Picture 34"/>
+            <wp:cNvGraphicFramePr>
+              <a:graphicFrameLocks noChangeAspect="1"/>
+            </wp:cNvGraphicFramePr>
+            <a:graphic>
+              <a:graphicData uri="http://schemas.openxmlformats.org/drawingml/2006/picture">
+                <pic:pic>
+                  <pic:nvPicPr>
+                    <pic:cNvPr id="0" name="git-redacted.png"/>
+                    <pic:cNvPicPr/>
+                  </pic:nvPicPr>
+                  <pic:blipFill>
+                    <a:blip r:embed="rId43"/>
+                    <a:stretch>
+                      <a:fillRect/>
+                    </a:stretch>
+                  </pic:blipFill>
+                  <pic:spPr>
+                    <a:xfrm>
+                      <a:off x="0" y="0"/>
+                      <a:ext cx="5303520" cy="2839401"/>
+                    </a:xfrm>
+                    <a:prstGeom prst="rect"/>
+                  </pic:spPr>
+                </pic:pic>
+              </a:graphicData>
+            </a:graphic>
+          </wp:inline>
+        </w:drawing>
+      </w:r>
+    </w:p>
+    <w:p>
+      <w:r>
         <w:t>Git 提交记录用于说明实验7实现与报告文件的版本管理情况。</w:t>
       </w:r>
     </w:p>

</xml_diff>